<commit_message>
add missing vars to the matching
</commit_message>
<xml_diff>
--- a/Matching_report_D3.docx
+++ b/Matching_report_D3.docx
@@ -2041,125 +2041,179 @@
     </w:p>
     <w:p>
       <w:pPr>
-        <w:pStyle w:val="BodyText"/>
-        <w:rPr>
-          <w:lang w:val="en-GB"/>
-        </w:rPr>
-      </w:pPr>
+        <w:spacing w:before="100" w:beforeAutospacing="1" w:after="100" w:afterAutospacing="1"/>
+        <w:rPr>
+          <w:rFonts w:eastAsia="Times New Roman"/>
+          <w:sz w:val="20"/>
+          <w:szCs w:val="20"/>
+        </w:rPr>
+      </w:pPr>
+      <w:r>
+        <w:t>From the potenti</w:t>
+      </w:r>
+      <w:r>
+        <w:t xml:space="preserve">al control pool there are </w:t>
+      </w:r>
+      <w:r>
+        <w:t xml:space="preserve">19,424 </w:t>
+      </w:r>
+      <w:r>
+        <w:t xml:space="preserve">control OAs from the </w:t>
+      </w:r>
+      <w:r>
+        <w:t xml:space="preserve">same city </w:t>
+      </w:r>
+      <w:r>
+        <w:t>of the CAZ/LEZ</w:t>
+      </w:r>
+      <w:r>
+        <w:t xml:space="preserve"> but outside CAZ and buffer)</w:t>
+      </w:r>
+      <w:r>
+        <w:t xml:space="preserve">. These were </w:t>
+      </w:r>
+      <w:r>
+        <w:t>marked</w:t>
+      </w:r>
+      <w:r>
+        <w:t xml:space="preserve"> to be used</w:t>
+      </w:r>
+      <w:r>
+        <w:t xml:space="preserve"> separately in a</w:t>
+      </w:r>
+      <w:r>
+        <w:t xml:space="preserve"> sensitivity analysis</w:t>
+      </w:r>
+      <w:r>
+        <w:rPr>
+          <w:rFonts w:ascii="Segoe UI" w:eastAsia="Times New Roman" w:hAnsi="Segoe UI" w:cs="Segoe UI"/>
+          <w:sz w:val="18"/>
+          <w:szCs w:val="18"/>
+        </w:rPr>
+        <w:t xml:space="preserve">. </w:t>
+      </w:r>
     </w:p>
     <w:p>
       <w:pPr>
         <w:pStyle w:val="BodyText"/>
-        <w:ind w:left="360"/>
-        <w:rPr>
-          <w:lang w:val="en-GB"/>
-        </w:rPr>
       </w:pPr>
     </w:p>
     <w:p>
       <w:pPr>
-        <w:pStyle w:val="Heading2"/>
-        <w:rPr>
-          <w:lang w:val="en-GB"/>
-        </w:rPr>
-      </w:pPr>
-      <w:r>
-        <w:rPr>
-          <w:lang w:val="en-GB"/>
-        </w:rPr>
-        <w:t xml:space="preserve">The matching process </w:t>
-      </w:r>
+        <w:pStyle w:val="BodyText"/>
+        <w:ind w:left="360"/>
+        <w:rPr>
+          <w:lang w:val="en-GB"/>
+        </w:rPr>
+      </w:pPr>
     </w:p>
     <w:p>
       <w:pPr>
-        <w:pStyle w:val="Heading3"/>
-      </w:pPr>
-      <w:r>
-        <w:t xml:space="preserve">Why matching </w:t>
+        <w:pStyle w:val="Heading2"/>
+        <w:rPr>
+          <w:lang w:val="en-GB"/>
+        </w:rPr>
+      </w:pPr>
+      <w:r>
+        <w:rPr>
+          <w:lang w:val="en-GB"/>
+        </w:rPr>
+        <w:t xml:space="preserve">The matching process </w:t>
       </w:r>
     </w:p>
     <w:p>
       <w:pPr>
-        <w:pStyle w:val="BodyText"/>
-      </w:pPr>
-      <w:r>
-        <w:t xml:space="preserve">CAZ/LEZ policies are not randomly assigned; they are implemented in large urban </w:t>
-      </w:r>
-      <w:proofErr w:type="spellStart"/>
-      <w:r>
-        <w:t>centres</w:t>
-      </w:r>
-      <w:proofErr w:type="spellEnd"/>
-      <w:r>
-        <w:t xml:space="preserve"> that differ systematically from other areas in terms of traffic volume, road network structure, population density, and sociodemographic composition. Using all untreated areas as controls—whether from the same local authority or from other cities—risks violating the parallel trends assumption because many areas have different baseline injury volumes, pre-treatment trends, and structural characteristics. Selecting controls from a single other city </w:t>
-      </w:r>
-      <w:proofErr w:type="spellStart"/>
-      <w:r>
-        <w:t>centre</w:t>
-      </w:r>
-      <w:proofErr w:type="spellEnd"/>
-      <w:r>
-        <w:t xml:space="preserve"> may improve comparability </w:t>
-      </w:r>
-      <w:proofErr w:type="gramStart"/>
-      <w:r>
-        <w:t>on</w:t>
-      </w:r>
-      <w:proofErr w:type="gramEnd"/>
-      <w:r>
-        <w:t xml:space="preserve"> some </w:t>
-      </w:r>
-      <w:proofErr w:type="gramStart"/>
-      <w:r>
-        <w:t>dimensions</w:t>
-      </w:r>
-      <w:r>
-        <w:t>,</w:t>
-      </w:r>
-      <w:r>
-        <w:t xml:space="preserve"> </w:t>
-      </w:r>
-      <w:r>
-        <w:t>but</w:t>
-      </w:r>
-      <w:proofErr w:type="gramEnd"/>
-      <w:r>
-        <w:t xml:space="preserve"> can still result in poor matches and may introduce bias</w:t>
-      </w:r>
-      <w:r>
-        <w:t xml:space="preserve">es related </w:t>
-      </w:r>
-      <w:r>
-        <w:t xml:space="preserve">to </w:t>
-      </w:r>
-      <w:r>
-        <w:t xml:space="preserve">possible other </w:t>
-      </w:r>
-      <w:r>
-        <w:t xml:space="preserve">interventions. Pooling controls across multiple cities can mitigate </w:t>
-      </w:r>
-      <w:r>
-        <w:t xml:space="preserve">and reduce such </w:t>
-      </w:r>
-      <w:r>
-        <w:t>biases</w:t>
-      </w:r>
-      <w:r>
-        <w:t>.</w:t>
+        <w:pStyle w:val="Heading3"/>
+      </w:pPr>
+      <w:r>
+        <w:t xml:space="preserve">Why matching </w:t>
       </w:r>
     </w:p>
     <w:p>
       <w:pPr>
         <w:pStyle w:val="BodyText"/>
-        <w:rPr>
-          <w:lang w:val="en-GB"/>
-        </w:rPr>
-      </w:pPr>
-      <w:r>
-        <w:rPr>
-          <w:lang w:val="en-GB"/>
-        </w:rPr>
+      </w:pPr>
+      <w:r>
+        <w:t xml:space="preserve">CAZ/LEZ policies are not randomly assigned; they are implemented in large urban </w:t>
+      </w:r>
+      <w:proofErr w:type="spellStart"/>
+      <w:r>
+        <w:t>centres</w:t>
+      </w:r>
+      <w:proofErr w:type="spellEnd"/>
+      <w:r>
+        <w:t xml:space="preserve"> that differ systematically from other areas in terms of traffic volume, road network structure, population density, and sociodemographic composition. Using all untreated areas as controls—whether from the same local authority or from other cities—risks violating the parallel trends assumption because many areas have different baseline injury volumes, pre-treatment trends, and structural characteristics. Selecting controls from a </w:t>
+      </w:r>
+      <w:r>
         <w:lastRenderedPageBreak/>
+        <w:t xml:space="preserve">single other city </w:t>
+      </w:r>
+      <w:proofErr w:type="spellStart"/>
+      <w:r>
+        <w:t>centre</w:t>
+      </w:r>
+      <w:proofErr w:type="spellEnd"/>
+      <w:r>
+        <w:t xml:space="preserve"> may improve comparability </w:t>
+      </w:r>
+      <w:proofErr w:type="gramStart"/>
+      <w:r>
+        <w:t>on</w:t>
+      </w:r>
+      <w:proofErr w:type="gramEnd"/>
+      <w:r>
+        <w:t xml:space="preserve"> some </w:t>
+      </w:r>
+      <w:proofErr w:type="gramStart"/>
+      <w:r>
+        <w:t>dimensions</w:t>
+      </w:r>
+      <w:r>
+        <w:t>,</w:t>
+      </w:r>
+      <w:r>
+        <w:t xml:space="preserve"> </w:t>
+      </w:r>
+      <w:r>
+        <w:t>but</w:t>
+      </w:r>
+      <w:proofErr w:type="gramEnd"/>
+      <w:r>
+        <w:t xml:space="preserve"> can still result in poor matches and may introduce bias</w:t>
+      </w:r>
+      <w:r>
+        <w:t xml:space="preserve">es related </w:t>
+      </w:r>
+      <w:r>
+        <w:t xml:space="preserve">to </w:t>
+      </w:r>
+      <w:r>
+        <w:t xml:space="preserve">possible other </w:t>
+      </w:r>
+      <w:r>
+        <w:t xml:space="preserve">interventions. Pooling controls across multiple cities can mitigate </w:t>
+      </w:r>
+      <w:r>
+        <w:t xml:space="preserve">and reduce such </w:t>
+      </w:r>
+      <w:r>
+        <w:t>biases</w:t>
+      </w:r>
+      <w:r>
+        <w:t>.</w:t>
+      </w:r>
+    </w:p>
+    <w:p>
+      <w:pPr>
+        <w:pStyle w:val="BodyText"/>
+        <w:rPr>
+          <w:lang w:val="en-GB"/>
+        </w:rPr>
+      </w:pPr>
+      <w:r>
+        <w:rPr>
+          <w:lang w:val="en-GB"/>
+        </w:rPr>
         <w:t>The matching address this and serves two functions:</w:t>
       </w:r>
     </w:p>
@@ -2370,11 +2424,8 @@
         <w:pStyle w:val="BodyText"/>
       </w:pPr>
       <w:r>
-        <w:t xml:space="preserve">Third, the two stages require different covariance structures. Stage 1 uses a pooled covariance matrix — computed from both treated and control units — to define global structural comparability across the full candidate pool. Stage 2 uses a treated-only </w:t>
-      </w:r>
-      <w:r>
         <w:lastRenderedPageBreak/>
-        <w:t xml:space="preserve">covariance matrix, which anchors the distance metric to the distribution of treated OAs, consistent with the focus of average treatment effect on the treated (ATT) estimation. A single-stage approach cannot apply these two different </w:t>
+        <w:t xml:space="preserve">Third, the two stages require different covariance structures. Stage 1 uses a pooled covariance matrix — computed from both treated and control units — to define global structural comparability across the full candidate pool. Stage 2 uses a treated-only covariance matrix, which anchors the distance metric to the distribution of treated OAs, consistent with the focus of average treatment effect on the treated (ATT) estimation. A single-stage approach cannot apply these two different </w:t>
       </w:r>
       <w:proofErr w:type="spellStart"/>
       <w:r>
@@ -2587,13 +2638,87 @@
         </w:rPr>
         <w:t xml:space="preserve">However, at the road-link level, the DiD analysis will drops road links with zero injuries throughout the study period. </w:t>
       </w:r>
+      <w:r>
+        <w:rPr>
+          <w:lang w:val="en-GB"/>
+        </w:rPr>
+        <w:t>R</w:t>
+      </w:r>
       <w:commentRangeStart w:id="6"/>
       <w:commentRangeStart w:id="7"/>
       <w:r>
         <w:rPr>
           <w:lang w:val="en-GB"/>
         </w:rPr>
-        <w:t>After removing zero-injury road links, zero-injury OAs account for only 0.02% of road links and 0.05% of total injuries in the analysis sample, contributing less than 0.1% of total pre-period injuries. Removing these road links is therefore highly unlikely to drive ATT estimates.</w:t>
+        <w:t>emoving zero-injury road links,</w:t>
+      </w:r>
+      <w:r>
+        <w:rPr>
+          <w:lang w:val="en-GB"/>
+        </w:rPr>
+        <w:t xml:space="preserve"> these</w:t>
+      </w:r>
+      <w:r>
+        <w:rPr>
+          <w:lang w:val="en-GB"/>
+        </w:rPr>
+        <w:t xml:space="preserve"> zero-injury OAs account for only 0.02% of road links and 0.05% of total injuries in the analysis sample, contributing less than 0.1% of total pre-period injuries. </w:t>
+      </w:r>
+      <w:proofErr w:type="gramStart"/>
+      <w:r>
+        <w:rPr>
+          <w:lang w:val="en-GB"/>
+        </w:rPr>
+        <w:t>T</w:t>
+      </w:r>
+      <w:r>
+        <w:rPr>
+          <w:lang w:val="en-GB"/>
+        </w:rPr>
+        <w:t>herefore</w:t>
+      </w:r>
+      <w:proofErr w:type="gramEnd"/>
+      <w:r>
+        <w:rPr>
+          <w:lang w:val="en-GB"/>
+        </w:rPr>
+        <w:t xml:space="preserve"> we excluded </w:t>
+      </w:r>
+      <w:r>
+        <w:rPr>
+          <w:lang w:val="en-GB"/>
+        </w:rPr>
+        <w:t>the zero injuries OAs up fron</w:t>
+      </w:r>
+      <w:r>
+        <w:rPr>
+          <w:lang w:val="en-GB"/>
+        </w:rPr>
+        <w:t xml:space="preserve">t </w:t>
+      </w:r>
+      <w:r>
+        <w:rPr>
+          <w:lang w:val="en-GB"/>
+        </w:rPr>
+        <w:t>from</w:t>
+      </w:r>
+      <w:r>
+        <w:rPr>
+          <w:lang w:val="en-GB"/>
+        </w:rPr>
+        <w:t xml:space="preserve"> the analysis as they are </w:t>
+      </w:r>
+      <w:r>
+        <w:rPr>
+          <w:lang w:val="en-GB"/>
+        </w:rPr>
+        <w:t xml:space="preserve">do not affect the DiD </w:t>
+      </w:r>
+      <w:r>
+        <w:rPr>
+          <w:lang w:val="en-GB"/>
+        </w:rPr>
+        <w:t>estimates.</w:t>
       </w:r>
       <w:commentRangeEnd w:id="6"/>
       <w:r>
@@ -2627,25 +2752,7 @@
         <w:rPr>
           <w:lang w:val="en-GB"/>
         </w:rPr>
-        <w:t>The</w:t>
-      </w:r>
-      <w:r>
-        <w:rPr>
-          <w:lang w:val="en-GB"/>
-        </w:rPr>
-        <w:t xml:space="preserve">refore, the </w:t>
-      </w:r>
-      <w:r>
-        <w:rPr>
-          <w:lang w:val="en-GB"/>
-        </w:rPr>
-        <w:t>analysis excludes the zero-injury treated OAs</w:t>
-      </w:r>
-      <w:r>
-        <w:rPr>
-          <w:lang w:val="en-GB"/>
-        </w:rPr>
-        <w:t xml:space="preserve">. The final </w:t>
+        <w:t xml:space="preserve">The final </w:t>
       </w:r>
       <w:r>
         <w:rPr>
@@ -2673,7 +2780,15 @@
           <w:sz w:val="28"/>
           <w:lang w:val="en-GB"/>
         </w:rPr>
-        <w:t>Covariate Construction and Transformation</w:t>
+        <w:t>C</w:t>
+      </w:r>
+      <w:r>
+        <w:rPr>
+          <w:rFonts w:eastAsia="Arial" w:cs="Arial"/>
+          <w:sz w:val="28"/>
+          <w:lang w:val="en-GB"/>
+        </w:rPr>
+        <w:t>ovariate Construction and Transformation</w:t>
       </w:r>
       <w:commentRangeEnd w:id="8"/>
       <w:r>
@@ -26916,20 +27031,12 @@
           <w:lang w:val="en-GB"/>
         </w:rPr>
       </w:pPr>
-      <w:commentRangeStart w:id="56"/>
       <w:r>
         <w:rPr>
           <w:lang w:val="en-GB"/>
         </w:rPr>
         <w:t>Main model: DiD approach, fixed effects, why design is appropriate</w:t>
       </w:r>
-      <w:r>
-        <w:rPr>
-          <w:rStyle w:val="CommentReference"/>
-        </w:rPr>
-        <w:commentReference w:id="56"/>
-      </w:r>
-      <w:commentRangeEnd w:id="56"/>
     </w:p>
     <w:p>
       <w:pPr>
@@ -27022,20 +27129,12 @@
           <w:lang w:val="en-GB"/>
         </w:rPr>
       </w:pPr>
-      <w:commentRangeStart w:id="57"/>
       <w:r>
         <w:rPr>
           <w:lang w:val="en-GB"/>
         </w:rPr>
         <w:t xml:space="preserve">Maybe this ends up in discussion of paper but good just to have something written now: </w:t>
       </w:r>
-      <w:r>
-        <w:rPr>
-          <w:rStyle w:val="CommentReference"/>
-        </w:rPr>
-        <w:commentReference w:id="57"/>
-      </w:r>
-      <w:commentRangeEnd w:id="57"/>
     </w:p>
     <w:p>
       <w:pPr>
@@ -28553,20 +28652,6 @@
       </w:r>
     </w:p>
   </w:comment>
-  <w:comment w:id="56" w:author="Posit Assistant" w:date="2026-05-05T16:57:00Z" w:initials="PA">
-    <w:p>
-      <w:r>
-        <w:t>PLACEHOLDER: Specify DiD estimator (TWFE vs Callaway-Sant'Anna for staggered adoption), fixed effects structure (time FE, road link FE), count model choice (Poisson/NB), and how parallel trends is formally tested.</w:t>
-      </w:r>
-    </w:p>
-  </w:comment>
-  <w:comment w:id="57" w:author="Posit Assistant" w:date="2026-05-05T16:57:00Z" w:initials="PA">
-    <w:p>
-      <w:r>
-        <w:t>PLACEHOLDER: Formalise as Limitations. Key items: STATS19 under-reporting; residual confounding from concurrent urban interventions; reliance on parallel trends (untestable post-treatment); road-link aggregation may mask within-OA heterogeneity.</w:t>
-      </w:r>
-    </w:p>
-  </w:comment>
 </w:comments>
 </file>
 
@@ -28574,17 +28659,17 @@
 <w15:commentsEx xmlns:wpc="http://schemas.microsoft.com/office/word/2010/wordprocessingCanvas" xmlns:cx="http://schemas.microsoft.com/office/drawing/2014/chartex" xmlns:cx1="http://schemas.microsoft.com/office/drawing/2015/9/8/chartex" xmlns:cx2="http://schemas.microsoft.com/office/drawing/2015/10/21/chartex" xmlns:cx3="http://schemas.microsoft.com/office/drawing/2016/5/9/chartex" xmlns:cx4="http://schemas.microsoft.com/office/drawing/2016/5/10/chartex" xmlns:cx5="http://schemas.microsoft.com/office/drawing/2016/5/11/chartex" xmlns:cx6="http://schemas.microsoft.com/office/drawing/2016/5/12/chartex" xmlns:cx7="http://schemas.microsoft.com/office/drawing/2016/5/13/chartex" xmlns:cx8="http://schemas.microsoft.com/office/drawing/2016/5/14/chartex" xmlns:mc="http://schemas.openxmlformats.org/markup-compatibility/2006" xmlns:aink="http://schemas.microsoft.com/office/drawing/2016/ink" xmlns:am3d="http://schemas.microsoft.com/office/drawing/2017/model3d" xmlns:o="urn:schemas-microsoft-com:office:office" xmlns:oel="http://schemas.microsoft.com/office/2019/extlst" xmlns:r="http://schemas.openxmlformats.org/officeDocument/2006/relationships" xmlns:m="http://schemas.openxmlformats.org/officeDocument/2006/math" xmlns:v="urn:schemas-microsoft-com:vml" xmlns:wp14="http://schemas.microsoft.com/office/word/2010/wordprocessingDrawing" xmlns:wp="http://schemas.openxmlformats.org/drawingml/2006/wordprocessingDrawing" xmlns:w10="urn:schemas-microsoft-com:office:word" xmlns:w="http://schemas.openxmlformats.org/wordprocessingml/2006/main" xmlns:w14="http://schemas.microsoft.com/office/word/2010/wordml" xmlns:w15="http://schemas.microsoft.com/office/word/2012/wordml" xmlns:w16cex="http://schemas.microsoft.com/office/word/2018/wordml/cex" xmlns:w16cid="http://schemas.microsoft.com/office/word/2016/wordml/cid" xmlns:w16="http://schemas.microsoft.com/office/word/2018/wordml" xmlns:w16du="http://schemas.microsoft.com/office/word/2023/wordml/word16du" xmlns:w16sdtdh="http://schemas.microsoft.com/office/word/2020/wordml/sdtdatahash" xmlns:w16sdtfl="http://schemas.microsoft.com/office/word/2024/wordml/sdtformatlock" xmlns:w16se="http://schemas.microsoft.com/office/word/2015/wordml/symex" xmlns:wpg="http://schemas.microsoft.com/office/word/2010/wordprocessingGroup" xmlns:wpi="http://schemas.microsoft.com/office/word/2010/wordprocessingInk" xmlns:wne="http://schemas.microsoft.com/office/word/2006/wordml" xmlns:wps="http://schemas.microsoft.com/office/word/2010/wordprocessingShape" mc:Ignorable="w14 w15 w16se w16cid w16 w16cex w16sdtdh w16sdtfl w16du wp14">
   <w15:commentEx w15:paraId="2C7E9863" w15:done="0"/>
   <w15:commentEx w15:paraId="2C7E9864" w15:done="0"/>
-  <w15:commentEx w15:paraId="2C7E9870" w15:done="0"/>
-  <w15:commentEx w15:paraId="2C7E9871" w15:done="0"/>
-  <w15:commentEx w15:paraId="2C7E9872" w15:done="0"/>
-  <w15:commentEx w15:paraId="2C7E9873" w15:done="0"/>
-  <w15:commentEx w15:paraId="2C7E9874" w15:done="0"/>
-  <w15:commentEx w15:paraId="2C7E9877" w15:done="0"/>
+  <w15:commentEx w15:paraId="2C7E9870" w15:done="1"/>
+  <w15:commentEx w15:paraId="2C7E9871" w15:done="1"/>
+  <w15:commentEx w15:paraId="2C7E9872" w15:done="1"/>
+  <w15:commentEx w15:paraId="2C7E9873" w15:done="1"/>
+  <w15:commentEx w15:paraId="2C7E9874" w15:done="1"/>
+  <w15:commentEx w15:paraId="2C7E9877" w15:done="1"/>
   <w15:commentEx w15:paraId="2C7E9878" w15:done="0"/>
   <w15:commentEx w15:paraId="2C7E987D" w15:done="0"/>
   <w15:commentEx w15:paraId="2C7E987E" w15:done="0"/>
   <w15:commentEx w15:paraId="2C7E987F" w15:done="0"/>
-  <w15:commentEx w15:paraId="2C7E9880" w15:done="0"/>
+  <w15:commentEx w15:paraId="2C7E9880" w15:done="1"/>
   <w15:commentEx w15:paraId="2C7E9881" w15:done="0"/>
   <w15:commentEx w15:paraId="2C7E9888" w15:done="0"/>
   <w15:commentEx w15:paraId="2C7E988B" w15:done="0"/>
@@ -28628,8 +28713,6 @@
   <w15:commentEx w15:paraId="2C7E98E1" w15:done="0"/>
   <w15:commentEx w15:paraId="2C7E98E2" w15:done="0"/>
   <w15:commentEx w15:paraId="2C7E98E3" w15:done="0"/>
-  <w15:commentEx w15:paraId="2C7E98E4" w15:done="0"/>
-  <w15:commentEx w15:paraId="2C7E98E5" w15:done="0"/>
 </w15:commentsEx>
 </file>
 
@@ -28691,8 +28774,6 @@
   <w16cid:commentId w16cid:paraId="2C7E98E1" w16cid:durableId="2C7E98E3"/>
   <w16cid:commentId w16cid:paraId="2C7E98E2" w16cid:durableId="2C7E98E4"/>
   <w16cid:commentId w16cid:paraId="2C7E98E3" w16cid:durableId="2C7E98E5"/>
-  <w16cid:commentId w16cid:paraId="2C7E98E4" w16cid:durableId="2C7E98E6"/>
-  <w16cid:commentId w16cid:paraId="2C7E98E5" w16cid:durableId="2C7E98E7"/>
 </w16cid:commentsIds>
 </file>
 
@@ -33720,7 +33801,6 @@
   <w:style w:type="character" w:default="1" w:styleId="DefaultParagraphFont">
     <w:name w:val="Default Paragraph Font"/>
     <w:uiPriority w:val="1"/>
-    <w:semiHidden/>
     <w:unhideWhenUsed/>
   </w:style>
   <w:style w:type="table" w:default="1" w:styleId="TableNormal">
@@ -34683,10 +34763,10 @@
     <w:rsid w:val="0060014F"/>
     <w:rsid w:val="0060065D"/>
     <w:rsid w:val="007379F6"/>
+    <w:rsid w:val="00802A6F"/>
     <w:rsid w:val="00863CC3"/>
     <w:rsid w:val="009328A8"/>
     <w:rsid w:val="00991ABA"/>
-    <w:rsid w:val="00AB755B"/>
     <w:rsid w:val="00B82DAF"/>
     <w:rsid w:val="00BD0786"/>
     <w:rsid w:val="00C2278E"/>

</xml_diff>